<commit_message>
feat(export): match sample layout for cover, index, text and tables
</commit_message>
<xml_diff>
--- a/templates/bmu-course-file.docx
+++ b/templates/bmu-course-file.docx
@@ -20,21 +20,7 @@
     </w:p>
     <w:p>
       <w:pPr>
-        <w:spacing w:after="600"/>
-        <w:jc w:val="center"/>
-      </w:pPr>
-      <w:r>
-        <w:rPr>
-          <w:rFonts w:ascii="Times New Roman" w:cs="Times New Roman" w:eastAsia="Times New Roman" w:hAnsi="Times New Roman"/>
-          <w:sz w:val="28"/>
-          <w:szCs w:val="28"/>
-        </w:rPr>
-        <w:t xml:space="preserve">{schoolName}</w:t>
-      </w:r>
-    </w:p>
-    <w:p>
-      <w:pPr>
-        <w:spacing w:after="600"/>
+        <w:spacing w:after="360"/>
         <w:jc w:val="center"/>
       </w:pPr>
       <w:r>
@@ -42,8 +28,25 @@
           <w:rFonts w:ascii="Times New Roman" w:cs="Times New Roman" w:eastAsia="Times New Roman" w:hAnsi="Times New Roman"/>
           <w:b/>
           <w:bCs/>
-          <w:sz w:val="48"/>
-          <w:szCs w:val="48"/>
+          <w:caps/>
+          <w:sz w:val="28"/>
+          <w:szCs w:val="28"/>
+        </w:rPr>
+        <w:t xml:space="preserve">{schoolName}</w:t>
+      </w:r>
+    </w:p>
+    <w:p>
+      <w:pPr>
+        <w:spacing w:after="720"/>
+        <w:jc w:val="center"/>
+      </w:pPr>
+      <w:r>
+        <w:rPr>
+          <w:rFonts w:ascii="Times New Roman" w:cs="Times New Roman" w:eastAsia="Times New Roman" w:hAnsi="Times New Roman"/>
+          <w:b/>
+          <w:bCs/>
+          <w:sz w:val="36"/>
+          <w:szCs w:val="36"/>
         </w:rPr>
         <w:t xml:space="preserve">COURSE FILE</w:t>
       </w:r>
@@ -61,18 +64,223 @@
         </w:tblBorders>
       </w:tblPr>
       <w:tblGrid>
-        <w:gridCol w:w="3000"/>
-        <w:gridCol w:w="6026"/>
+        <w:gridCol w:w="9026"/>
       </w:tblGrid>
       <w:tr>
         <w:tc>
           <w:tcPr>
-            <w:tcW w:type="dxa" w:w="3000"/>
+            <w:tcW w:type="dxa" w:w="9026"/>
             <w:tcBorders>
-              <w:top w:val="single" w:color="808080" w:sz="4"/>
-              <w:left w:val="single" w:color="808080" w:sz="4"/>
-              <w:bottom w:val="single" w:color="808080" w:sz="4"/>
-              <w:right w:val="single" w:color="808080" w:sz="4"/>
+              <w:top w:val="double" w:color="000000" w:sz="6"/>
+              <w:left w:val="double" w:color="000000" w:sz="6"/>
+              <w:bottom w:val="double" w:color="000000" w:sz="6"/>
+              <w:right w:val="double" w:color="000000" w:sz="6"/>
+            </w:tcBorders>
+            <w:tcMar>
+              <w:top w:type="dxa" w:w="200"/>
+              <w:left w:type="dxa" w:w="200"/>
+              <w:bottom w:type="dxa" w:w="200"/>
+              <w:right w:type="dxa" w:w="200"/>
+            </w:tcMar>
+          </w:tcPr>
+          <w:p>
+            <w:pPr>
+              <w:spacing w:after="120" w:before="120"/>
+              <w:jc w:val="center"/>
+            </w:pPr>
+            <w:r>
+              <w:rPr>
+                <w:rFonts w:ascii="Times New Roman" w:cs="Times New Roman" w:eastAsia="Times New Roman" w:hAnsi="Times New Roman"/>
+                <w:b/>
+                <w:bCs/>
+              </w:rPr>
+              <w:t xml:space="preserve">Program: </w:t>
+            </w:r>
+            <w:r>
+              <w:rPr>
+                <w:rFonts w:ascii="Times New Roman" w:cs="Times New Roman" w:eastAsia="Times New Roman" w:hAnsi="Times New Roman"/>
+                <w:b/>
+                <w:bCs/>
+              </w:rPr>
+              <w:t xml:space="preserve">{programLine}</w:t>
+            </w:r>
+          </w:p>
+          <w:p>
+            <w:pPr>
+              <w:spacing w:after="120" w:before="120"/>
+              <w:jc w:val="center"/>
+            </w:pPr>
+            <w:r>
+              <w:rPr>
+                <w:rFonts w:ascii="Times New Roman" w:cs="Times New Roman" w:eastAsia="Times New Roman" w:hAnsi="Times New Roman"/>
+                <w:b/>
+                <w:bCs/>
+              </w:rPr>
+              <w:t xml:space="preserve">Subject Code &amp; Name: </w:t>
+            </w:r>
+            <w:r>
+              <w:rPr>
+                <w:rFonts w:ascii="Times New Roman" w:cs="Times New Roman" w:eastAsia="Times New Roman" w:hAnsi="Times New Roman"/>
+                <w:b/>
+                <w:bCs/>
+              </w:rPr>
+              <w:t xml:space="preserve">{subjectLine}</w:t>
+            </w:r>
+          </w:p>
+          <w:p>
+            <w:pPr>
+              <w:spacing w:after="120" w:before="120"/>
+              <w:jc w:val="center"/>
+            </w:pPr>
+            <w:r>
+              <w:rPr>
+                <w:rFonts w:ascii="Times New Roman" w:cs="Times New Roman" w:eastAsia="Times New Roman" w:hAnsi="Times New Roman"/>
+                <w:b/>
+                <w:bCs/>
+              </w:rPr>
+              <w:t xml:space="preserve">Faculty: </w:t>
+            </w:r>
+            <w:r>
+              <w:rPr>
+                <w:rFonts w:ascii="Times New Roman" w:cs="Times New Roman" w:eastAsia="Times New Roman" w:hAnsi="Times New Roman"/>
+                <w:b/>
+                <w:bCs/>
+              </w:rPr>
+              <w:t xml:space="preserve">{coordinatorName}</w:t>
+            </w:r>
+          </w:p>
+          <w:p>
+            <w:pPr>
+              <w:spacing w:after="120" w:before="120"/>
+              <w:jc w:val="center"/>
+            </w:pPr>
+            <w:r>
+              <w:rPr>
+                <w:rFonts w:ascii="Times New Roman" w:cs="Times New Roman" w:eastAsia="Times New Roman" w:hAnsi="Times New Roman"/>
+                <w:b/>
+                <w:bCs/>
+              </w:rPr>
+              <w:t xml:space="preserve">Module/Semester: </w:t>
+            </w:r>
+            <w:r>
+              <w:rPr>
+                <w:rFonts w:ascii="Times New Roman" w:cs="Times New Roman" w:eastAsia="Times New Roman" w:hAnsi="Times New Roman"/>
+                <w:b/>
+                <w:bCs/>
+              </w:rPr>
+              <w:t xml:space="preserve">{semester}</w:t>
+            </w:r>
+          </w:p>
+          <w:p>
+            <w:pPr>
+              <w:spacing w:after="120" w:before="120"/>
+              <w:jc w:val="center"/>
+            </w:pPr>
+            <w:r>
+              <w:rPr>
+                <w:rFonts w:ascii="Times New Roman" w:cs="Times New Roman" w:eastAsia="Times New Roman" w:hAnsi="Times New Roman"/>
+                <w:b/>
+                <w:bCs/>
+              </w:rPr>
+              <w:t xml:space="preserve">Session: </w:t>
+            </w:r>
+            <w:r>
+              <w:rPr>
+                <w:rFonts w:ascii="Times New Roman" w:cs="Times New Roman" w:eastAsia="Times New Roman" w:hAnsi="Times New Roman"/>
+                <w:b/>
+                <w:bCs/>
+              </w:rPr>
+              <w:t xml:space="preserve">{academicYear}</w:t>
+            </w:r>
+          </w:p>
+        </w:tc>
+      </w:tr>
+    </w:tbl>
+    <w:p>
+      <w:pPr>
+        <w:spacing w:after="60" w:before="480"/>
+        <w:jc w:val="center"/>
+      </w:pPr>
+      <w:r>
+        <w:rPr>
+          <w:rFonts w:ascii="Times New Roman" w:cs="Times New Roman" w:eastAsia="Times New Roman" w:hAnsi="Times New Roman"/>
+          <w:b/>
+          <w:bCs/>
+        </w:rPr>
+        <w:t xml:space="preserve">Document ID: {documentId}</w:t>
+      </w:r>
+    </w:p>
+    <w:p>
+      <w:pPr>
+        <w:jc w:val="center"/>
+      </w:pPr>
+      <w:r>
+        <w:rPr>
+          <w:rFonts w:ascii="Times New Roman" w:cs="Times New Roman" w:eastAsia="Times New Roman" w:hAnsi="Times New Roman"/>
+        </w:rPr>
+        <w:t xml:space="preserve">Generated on: {generatedOn}</w:t>
+      </w:r>
+    </w:p>
+    <w:p>
+      <w:pPr>
+        <w:spacing w:before="300"/>
+        <w:jc w:val="center"/>
+      </w:pPr>
+      <w:r>
+        <w:rPr>
+          <w:rFonts w:ascii="Times New Roman" w:cs="Times New Roman" w:eastAsia="Times New Roman" w:hAnsi="Times New Roman"/>
+          <w:b/>
+          <w:bCs/>
+          <w:color w:val="C00000"/>
+          <w:sz w:val="24"/>
+          <w:szCs w:val="24"/>
+        </w:rPr>
+        <w:t xml:space="preserve">{draftNotice}</w:t>
+      </w:r>
+    </w:p>
+    <w:p>
+      <w:pPr>
+        <w:pageBreakBefore/>
+        <w:spacing w:after="240"/>
+        <w:jc w:val="center"/>
+      </w:pPr>
+      <w:r>
+        <w:rPr>
+          <w:rFonts w:ascii="Times New Roman" w:cs="Times New Roman" w:eastAsia="Times New Roman" w:hAnsi="Times New Roman"/>
+          <w:b/>
+          <w:bCs/>
+          <w:sz w:val="28"/>
+          <w:szCs w:val="28"/>
+          <w:u w:val="single"/>
+        </w:rPr>
+        <w:t xml:space="preserve">Index</w:t>
+      </w:r>
+    </w:p>
+    <w:tbl>
+      <w:tblPr>
+        <w:tblW w:type="dxa" w:w="9026"/>
+        <w:tblBorders>
+          <w:top w:val="single" w:color="auto" w:sz="4"/>
+          <w:left w:val="single" w:color="auto" w:sz="4"/>
+          <w:bottom w:val="single" w:color="auto" w:sz="4"/>
+          <w:right w:val="single" w:color="auto" w:sz="4"/>
+          <w:insideH w:val="single" w:color="auto" w:sz="4"/>
+          <w:insideV w:val="single" w:color="auto" w:sz="4"/>
+        </w:tblBorders>
+      </w:tblPr>
+      <w:tblGrid>
+        <w:gridCol w:w="900"/>
+        <w:gridCol w:w="8126"/>
+      </w:tblGrid>
+      <w:tr>
+        <w:tc>
+          <w:tcPr>
+            <w:tcW w:type="dxa" w:w="900"/>
+            <w:tcBorders>
+              <w:top w:val="single" w:color="000000" w:sz="4"/>
+              <w:left w:val="single" w:color="000000" w:sz="4"/>
+              <w:bottom w:val="single" w:color="000000" w:sz="4"/>
+              <w:right w:val="single" w:color="000000" w:sz="4"/>
             </w:tcBorders>
             <w:tcMar>
               <w:top w:type="dxa" w:w="60"/>
@@ -82,24 +290,27 @@
             </w:tcMar>
           </w:tcPr>
           <w:p>
+            <w:pPr>
+              <w:jc w:val="center"/>
+            </w:pPr>
             <w:r>
               <w:rPr>
                 <w:rFonts w:ascii="Times New Roman" w:cs="Times New Roman" w:eastAsia="Times New Roman" w:hAnsi="Times New Roman"/>
                 <w:b/>
                 <w:bCs/>
               </w:rPr>
-              <w:t xml:space="preserve">Program</w:t>
+              <w:t xml:space="preserve">{#sections}{number}.</w:t>
             </w:r>
           </w:p>
         </w:tc>
         <w:tc>
           <w:tcPr>
-            <w:tcW w:type="dxa" w:w="6026"/>
+            <w:tcW w:type="dxa" w:w="8126"/>
             <w:tcBorders>
-              <w:top w:val="single" w:color="808080" w:sz="4"/>
-              <w:left w:val="single" w:color="808080" w:sz="4"/>
-              <w:bottom w:val="single" w:color="808080" w:sz="4"/>
-              <w:right w:val="single" w:color="808080" w:sz="4"/>
+              <w:top w:val="single" w:color="000000" w:sz="4"/>
+              <w:left w:val="single" w:color="000000" w:sz="4"/>
+              <w:bottom w:val="single" w:color="000000" w:sz="4"/>
+              <w:right w:val="single" w:color="000000" w:sz="4"/>
             </w:tcBorders>
             <w:tcMar>
               <w:top w:type="dxa" w:w="60"/>
@@ -109,509 +320,22 @@
             </w:tcMar>
           </w:tcPr>
           <w:p>
-            <w:r>
-              <w:rPr>
-                <w:rFonts w:ascii="Times New Roman" w:cs="Times New Roman" w:eastAsia="Times New Roman" w:hAnsi="Times New Roman"/>
-              </w:rPr>
-              <w:t xml:space="preserve">{programName}</w:t>
-            </w:r>
-          </w:p>
-        </w:tc>
-      </w:tr>
-      <w:tr>
-        <w:tc>
-          <w:tcPr>
-            <w:tcW w:type="dxa" w:w="3000"/>
-            <w:tcBorders>
-              <w:top w:val="single" w:color="808080" w:sz="4"/>
-              <w:left w:val="single" w:color="808080" w:sz="4"/>
-              <w:bottom w:val="single" w:color="808080" w:sz="4"/>
-              <w:right w:val="single" w:color="808080" w:sz="4"/>
-            </w:tcBorders>
-            <w:tcMar>
-              <w:top w:type="dxa" w:w="60"/>
-              <w:left w:type="dxa" w:w="100"/>
-              <w:bottom w:type="dxa" w:w="60"/>
-              <w:right w:type="dxa" w:w="100"/>
-            </w:tcMar>
-          </w:tcPr>
-          <w:p>
+            <w:pPr>
+              <w:jc w:val="left"/>
+            </w:pPr>
             <w:r>
               <w:rPr>
                 <w:rFonts w:ascii="Times New Roman" w:cs="Times New Roman" w:eastAsia="Times New Roman" w:hAnsi="Times New Roman"/>
                 <w:b/>
                 <w:bCs/>
               </w:rPr>
-              <w:t xml:space="preserve">Course code</w:t>
-            </w:r>
-          </w:p>
-        </w:tc>
-        <w:tc>
-          <w:tcPr>
-            <w:tcW w:type="dxa" w:w="6026"/>
-            <w:tcBorders>
-              <w:top w:val="single" w:color="808080" w:sz="4"/>
-              <w:left w:val="single" w:color="808080" w:sz="4"/>
-              <w:bottom w:val="single" w:color="808080" w:sz="4"/>
-              <w:right w:val="single" w:color="808080" w:sz="4"/>
-            </w:tcBorders>
-            <w:tcMar>
-              <w:top w:type="dxa" w:w="60"/>
-              <w:left w:type="dxa" w:w="100"/>
-              <w:bottom w:type="dxa" w:w="60"/>
-              <w:right w:type="dxa" w:w="100"/>
-            </w:tcMar>
-          </w:tcPr>
-          <w:p>
-            <w:r>
-              <w:rPr>
-                <w:rFonts w:ascii="Times New Roman" w:cs="Times New Roman" w:eastAsia="Times New Roman" w:hAnsi="Times New Roman"/>
-              </w:rPr>
-              <w:t xml:space="preserve">{courseCode}</w:t>
-            </w:r>
-          </w:p>
-        </w:tc>
-      </w:tr>
-      <w:tr>
-        <w:tc>
-          <w:tcPr>
-            <w:tcW w:type="dxa" w:w="3000"/>
-            <w:tcBorders>
-              <w:top w:val="single" w:color="808080" w:sz="4"/>
-              <w:left w:val="single" w:color="808080" w:sz="4"/>
-              <w:bottom w:val="single" w:color="808080" w:sz="4"/>
-              <w:right w:val="single" w:color="808080" w:sz="4"/>
-            </w:tcBorders>
-            <w:tcMar>
-              <w:top w:type="dxa" w:w="60"/>
-              <w:left w:type="dxa" w:w="100"/>
-              <w:bottom w:type="dxa" w:w="60"/>
-              <w:right w:type="dxa" w:w="100"/>
-            </w:tcMar>
-          </w:tcPr>
-          <w:p>
-            <w:r>
-              <w:rPr>
-                <w:rFonts w:ascii="Times New Roman" w:cs="Times New Roman" w:eastAsia="Times New Roman" w:hAnsi="Times New Roman"/>
-                <w:b/>
-                <w:bCs/>
-              </w:rPr>
-              <w:t xml:space="preserve">Course title</w:t>
-            </w:r>
-          </w:p>
-        </w:tc>
-        <w:tc>
-          <w:tcPr>
-            <w:tcW w:type="dxa" w:w="6026"/>
-            <w:tcBorders>
-              <w:top w:val="single" w:color="808080" w:sz="4"/>
-              <w:left w:val="single" w:color="808080" w:sz="4"/>
-              <w:bottom w:val="single" w:color="808080" w:sz="4"/>
-              <w:right w:val="single" w:color="808080" w:sz="4"/>
-            </w:tcBorders>
-            <w:tcMar>
-              <w:top w:type="dxa" w:w="60"/>
-              <w:left w:type="dxa" w:w="100"/>
-              <w:bottom w:type="dxa" w:w="60"/>
-              <w:right w:type="dxa" w:w="100"/>
-            </w:tcMar>
-          </w:tcPr>
-          <w:p>
-            <w:r>
-              <w:rPr>
-                <w:rFonts w:ascii="Times New Roman" w:cs="Times New Roman" w:eastAsia="Times New Roman" w:hAnsi="Times New Roman"/>
-              </w:rPr>
-              <w:t xml:space="preserve">{courseTitle}</w:t>
-            </w:r>
-          </w:p>
-        </w:tc>
-      </w:tr>
-      <w:tr>
-        <w:tc>
-          <w:tcPr>
-            <w:tcW w:type="dxa" w:w="3000"/>
-            <w:tcBorders>
-              <w:top w:val="single" w:color="808080" w:sz="4"/>
-              <w:left w:val="single" w:color="808080" w:sz="4"/>
-              <w:bottom w:val="single" w:color="808080" w:sz="4"/>
-              <w:right w:val="single" w:color="808080" w:sz="4"/>
-            </w:tcBorders>
-            <w:tcMar>
-              <w:top w:type="dxa" w:w="60"/>
-              <w:left w:type="dxa" w:w="100"/>
-              <w:bottom w:type="dxa" w:w="60"/>
-              <w:right w:type="dxa" w:w="100"/>
-            </w:tcMar>
-          </w:tcPr>
-          <w:p>
-            <w:r>
-              <w:rPr>
-                <w:rFonts w:ascii="Times New Roman" w:cs="Times New Roman" w:eastAsia="Times New Roman" w:hAnsi="Times New Roman"/>
-                <w:b/>
-                <w:bCs/>
-              </w:rPr>
-              <w:t xml:space="preserve">Semester / term</w:t>
-            </w:r>
-          </w:p>
-        </w:tc>
-        <w:tc>
-          <w:tcPr>
-            <w:tcW w:type="dxa" w:w="6026"/>
-            <w:tcBorders>
-              <w:top w:val="single" w:color="808080" w:sz="4"/>
-              <w:left w:val="single" w:color="808080" w:sz="4"/>
-              <w:bottom w:val="single" w:color="808080" w:sz="4"/>
-              <w:right w:val="single" w:color="808080" w:sz="4"/>
-            </w:tcBorders>
-            <w:tcMar>
-              <w:top w:type="dxa" w:w="60"/>
-              <w:left w:type="dxa" w:w="100"/>
-              <w:bottom w:type="dxa" w:w="60"/>
-              <w:right w:type="dxa" w:w="100"/>
-            </w:tcMar>
-          </w:tcPr>
-          <w:p>
-            <w:r>
-              <w:rPr>
-                <w:rFonts w:ascii="Times New Roman" w:cs="Times New Roman" w:eastAsia="Times New Roman" w:hAnsi="Times New Roman"/>
-              </w:rPr>
-              <w:t xml:space="preserve">{semester}</w:t>
-            </w:r>
-          </w:p>
-        </w:tc>
-      </w:tr>
-      <w:tr>
-        <w:tc>
-          <w:tcPr>
-            <w:tcW w:type="dxa" w:w="3000"/>
-            <w:tcBorders>
-              <w:top w:val="single" w:color="808080" w:sz="4"/>
-              <w:left w:val="single" w:color="808080" w:sz="4"/>
-              <w:bottom w:val="single" w:color="808080" w:sz="4"/>
-              <w:right w:val="single" w:color="808080" w:sz="4"/>
-            </w:tcBorders>
-            <w:tcMar>
-              <w:top w:type="dxa" w:w="60"/>
-              <w:left w:type="dxa" w:w="100"/>
-              <w:bottom w:type="dxa" w:w="60"/>
-              <w:right w:type="dxa" w:w="100"/>
-            </w:tcMar>
-          </w:tcPr>
-          <w:p>
-            <w:r>
-              <w:rPr>
-                <w:rFonts w:ascii="Times New Roman" w:cs="Times New Roman" w:eastAsia="Times New Roman" w:hAnsi="Times New Roman"/>
-                <w:b/>
-                <w:bCs/>
-              </w:rPr>
-              <w:t xml:space="preserve">Academic year</w:t>
-            </w:r>
-          </w:p>
-        </w:tc>
-        <w:tc>
-          <w:tcPr>
-            <w:tcW w:type="dxa" w:w="6026"/>
-            <w:tcBorders>
-              <w:top w:val="single" w:color="808080" w:sz="4"/>
-              <w:left w:val="single" w:color="808080" w:sz="4"/>
-              <w:bottom w:val="single" w:color="808080" w:sz="4"/>
-              <w:right w:val="single" w:color="808080" w:sz="4"/>
-            </w:tcBorders>
-            <w:tcMar>
-              <w:top w:type="dxa" w:w="60"/>
-              <w:left w:type="dxa" w:w="100"/>
-              <w:bottom w:type="dxa" w:w="60"/>
-              <w:right w:type="dxa" w:w="100"/>
-            </w:tcMar>
-          </w:tcPr>
-          <w:p>
-            <w:r>
-              <w:rPr>
-                <w:rFonts w:ascii="Times New Roman" w:cs="Times New Roman" w:eastAsia="Times New Roman" w:hAnsi="Times New Roman"/>
-              </w:rPr>
-              <w:t xml:space="preserve">{academicYear}</w:t>
-            </w:r>
-          </w:p>
-        </w:tc>
-      </w:tr>
-      <w:tr>
-        <w:tc>
-          <w:tcPr>
-            <w:tcW w:type="dxa" w:w="3000"/>
-            <w:tcBorders>
-              <w:top w:val="single" w:color="808080" w:sz="4"/>
-              <w:left w:val="single" w:color="808080" w:sz="4"/>
-              <w:bottom w:val="single" w:color="808080" w:sz="4"/>
-              <w:right w:val="single" w:color="808080" w:sz="4"/>
-            </w:tcBorders>
-            <w:tcMar>
-              <w:top w:type="dxa" w:w="60"/>
-              <w:left w:type="dxa" w:w="100"/>
-              <w:bottom w:type="dxa" w:w="60"/>
-              <w:right w:type="dxa" w:w="100"/>
-            </w:tcMar>
-          </w:tcPr>
-          <w:p>
-            <w:r>
-              <w:rPr>
-                <w:rFonts w:ascii="Times New Roman" w:cs="Times New Roman" w:eastAsia="Times New Roman" w:hAnsi="Times New Roman"/>
-                <w:b/>
-                <w:bCs/>
-              </w:rPr>
-              <w:t xml:space="preserve">Batch</w:t>
-            </w:r>
-          </w:p>
-        </w:tc>
-        <w:tc>
-          <w:tcPr>
-            <w:tcW w:type="dxa" w:w="6026"/>
-            <w:tcBorders>
-              <w:top w:val="single" w:color="808080" w:sz="4"/>
-              <w:left w:val="single" w:color="808080" w:sz="4"/>
-              <w:bottom w:val="single" w:color="808080" w:sz="4"/>
-              <w:right w:val="single" w:color="808080" w:sz="4"/>
-            </w:tcBorders>
-            <w:tcMar>
-              <w:top w:type="dxa" w:w="60"/>
-              <w:left w:type="dxa" w:w="100"/>
-              <w:bottom w:type="dxa" w:w="60"/>
-              <w:right w:type="dxa" w:w="100"/>
-            </w:tcMar>
-          </w:tcPr>
-          <w:p>
-            <w:r>
-              <w:rPr>
-                <w:rFonts w:ascii="Times New Roman" w:cs="Times New Roman" w:eastAsia="Times New Roman" w:hAnsi="Times New Roman"/>
-              </w:rPr>
-              <w:t xml:space="preserve">{batch}</w:t>
-            </w:r>
-          </w:p>
-        </w:tc>
-      </w:tr>
-      <w:tr>
-        <w:tc>
-          <w:tcPr>
-            <w:tcW w:type="dxa" w:w="3000"/>
-            <w:tcBorders>
-              <w:top w:val="single" w:color="808080" w:sz="4"/>
-              <w:left w:val="single" w:color="808080" w:sz="4"/>
-              <w:bottom w:val="single" w:color="808080" w:sz="4"/>
-              <w:right w:val="single" w:color="808080" w:sz="4"/>
-            </w:tcBorders>
-            <w:tcMar>
-              <w:top w:type="dxa" w:w="60"/>
-              <w:left w:type="dxa" w:w="100"/>
-              <w:bottom w:type="dxa" w:w="60"/>
-              <w:right w:type="dxa" w:w="100"/>
-            </w:tcMar>
-          </w:tcPr>
-          <w:p>
-            <w:r>
-              <w:rPr>
-                <w:rFonts w:ascii="Times New Roman" w:cs="Times New Roman" w:eastAsia="Times New Roman" w:hAnsi="Times New Roman"/>
-                <w:b/>
-                <w:bCs/>
-              </w:rPr>
-              <w:t xml:space="preserve">Course coordinator</w:t>
-            </w:r>
-          </w:p>
-        </w:tc>
-        <w:tc>
-          <w:tcPr>
-            <w:tcW w:type="dxa" w:w="6026"/>
-            <w:tcBorders>
-              <w:top w:val="single" w:color="808080" w:sz="4"/>
-              <w:left w:val="single" w:color="808080" w:sz="4"/>
-              <w:bottom w:val="single" w:color="808080" w:sz="4"/>
-              <w:right w:val="single" w:color="808080" w:sz="4"/>
-            </w:tcBorders>
-            <w:tcMar>
-              <w:top w:type="dxa" w:w="60"/>
-              <w:left w:type="dxa" w:w="100"/>
-              <w:bottom w:type="dxa" w:w="60"/>
-              <w:right w:type="dxa" w:w="100"/>
-            </w:tcMar>
-          </w:tcPr>
-          <w:p>
-            <w:r>
-              <w:rPr>
-                <w:rFonts w:ascii="Times New Roman" w:cs="Times New Roman" w:eastAsia="Times New Roman" w:hAnsi="Times New Roman"/>
-              </w:rPr>
-              <w:t xml:space="preserve">{coordinatorName}</w:t>
-            </w:r>
-          </w:p>
-        </w:tc>
-      </w:tr>
-      <w:tr>
-        <w:tc>
-          <w:tcPr>
-            <w:tcW w:type="dxa" w:w="3000"/>
-            <w:tcBorders>
-              <w:top w:val="single" w:color="808080" w:sz="4"/>
-              <w:left w:val="single" w:color="808080" w:sz="4"/>
-              <w:bottom w:val="single" w:color="808080" w:sz="4"/>
-              <w:right w:val="single" w:color="808080" w:sz="4"/>
-            </w:tcBorders>
-            <w:tcMar>
-              <w:top w:type="dxa" w:w="60"/>
-              <w:left w:type="dxa" w:w="100"/>
-              <w:bottom w:type="dxa" w:w="60"/>
-              <w:right w:type="dxa" w:w="100"/>
-            </w:tcMar>
-          </w:tcPr>
-          <w:p>
-            <w:r>
-              <w:rPr>
-                <w:rFonts w:ascii="Times New Roman" w:cs="Times New Roman" w:eastAsia="Times New Roman" w:hAnsi="Times New Roman"/>
-                <w:b/>
-                <w:bCs/>
-              </w:rPr>
-              <w:t xml:space="preserve">Document ID</w:t>
-            </w:r>
-          </w:p>
-        </w:tc>
-        <w:tc>
-          <w:tcPr>
-            <w:tcW w:type="dxa" w:w="6026"/>
-            <w:tcBorders>
-              <w:top w:val="single" w:color="808080" w:sz="4"/>
-              <w:left w:val="single" w:color="808080" w:sz="4"/>
-              <w:bottom w:val="single" w:color="808080" w:sz="4"/>
-              <w:right w:val="single" w:color="808080" w:sz="4"/>
-            </w:tcBorders>
-            <w:tcMar>
-              <w:top w:type="dxa" w:w="60"/>
-              <w:left w:type="dxa" w:w="100"/>
-              <w:bottom w:type="dxa" w:w="60"/>
-              <w:right w:type="dxa" w:w="100"/>
-            </w:tcMar>
-          </w:tcPr>
-          <w:p>
-            <w:r>
-              <w:rPr>
-                <w:rFonts w:ascii="Times New Roman" w:cs="Times New Roman" w:eastAsia="Times New Roman" w:hAnsi="Times New Roman"/>
-              </w:rPr>
-              <w:t xml:space="preserve">{documentId}</w:t>
-            </w:r>
-          </w:p>
-        </w:tc>
-      </w:tr>
-      <w:tr>
-        <w:tc>
-          <w:tcPr>
-            <w:tcW w:type="dxa" w:w="3000"/>
-            <w:tcBorders>
-              <w:top w:val="single" w:color="808080" w:sz="4"/>
-              <w:left w:val="single" w:color="808080" w:sz="4"/>
-              <w:bottom w:val="single" w:color="808080" w:sz="4"/>
-              <w:right w:val="single" w:color="808080" w:sz="4"/>
-            </w:tcBorders>
-            <w:tcMar>
-              <w:top w:type="dxa" w:w="60"/>
-              <w:left w:type="dxa" w:w="100"/>
-              <w:bottom w:type="dxa" w:w="60"/>
-              <w:right w:type="dxa" w:w="100"/>
-            </w:tcMar>
-          </w:tcPr>
-          <w:p>
-            <w:r>
-              <w:rPr>
-                <w:rFonts w:ascii="Times New Roman" w:cs="Times New Roman" w:eastAsia="Times New Roman" w:hAnsi="Times New Roman"/>
-                <w:b/>
-                <w:bCs/>
-              </w:rPr>
-              <w:t xml:space="preserve">Generated on</w:t>
-            </w:r>
-          </w:p>
-        </w:tc>
-        <w:tc>
-          <w:tcPr>
-            <w:tcW w:type="dxa" w:w="6026"/>
-            <w:tcBorders>
-              <w:top w:val="single" w:color="808080" w:sz="4"/>
-              <w:left w:val="single" w:color="808080" w:sz="4"/>
-              <w:bottom w:val="single" w:color="808080" w:sz="4"/>
-              <w:right w:val="single" w:color="808080" w:sz="4"/>
-            </w:tcBorders>
-            <w:tcMar>
-              <w:top w:type="dxa" w:w="60"/>
-              <w:left w:type="dxa" w:w="100"/>
-              <w:bottom w:type="dxa" w:w="60"/>
-              <w:right w:type="dxa" w:w="100"/>
-            </w:tcMar>
-          </w:tcPr>
-          <w:p>
-            <w:r>
-              <w:rPr>
-                <w:rFonts w:ascii="Times New Roman" w:cs="Times New Roman" w:eastAsia="Times New Roman" w:hAnsi="Times New Roman"/>
-              </w:rPr>
-              <w:t xml:space="preserve">{generatedOn}</w:t>
+              <w:t xml:space="preserve">{title}{/sections}</w:t>
             </w:r>
           </w:p>
         </w:tc>
       </w:tr>
     </w:tbl>
     <w:p>
-      <w:pPr>
-        <w:spacing w:before="400"/>
-        <w:jc w:val="center"/>
-      </w:pPr>
-      <w:r>
-        <w:rPr>
-          <w:rFonts w:ascii="Times New Roman" w:cs="Times New Roman" w:eastAsia="Times New Roman" w:hAnsi="Times New Roman"/>
-          <w:b/>
-          <w:bCs/>
-          <w:color w:val="C00000"/>
-          <w:sz w:val="24"/>
-          <w:szCs w:val="24"/>
-        </w:rPr>
-        <w:t xml:space="preserve">{draftNotice}</w:t>
-      </w:r>
-    </w:p>
-    <w:p>
-      <w:pPr>
-        <w:pageBreakBefore/>
-        <w:spacing w:after="240"/>
-      </w:pPr>
-      <w:r>
-        <w:rPr>
-          <w:rFonts w:ascii="Times New Roman" w:cs="Times New Roman" w:eastAsia="Times New Roman" w:hAnsi="Times New Roman"/>
-          <w:b/>
-          <w:bCs/>
-          <w:sz w:val="32"/>
-          <w:szCs w:val="32"/>
-        </w:rPr>
-        <w:t xml:space="preserve">Index</w:t>
-      </w:r>
-    </w:p>
-    <w:p>
-      <w:r>
-        <w:rPr>
-          <w:rFonts w:ascii="Times New Roman" w:cs="Times New Roman" w:eastAsia="Times New Roman" w:hAnsi="Times New Roman"/>
-        </w:rPr>
-        <w:t xml:space="preserve">{#sections}</w:t>
-      </w:r>
-    </w:p>
-    <w:p>
-      <w:pPr>
-        <w:spacing w:after="80"/>
-      </w:pPr>
-      <w:r>
-        <w:rPr>
-          <w:rFonts w:ascii="Times New Roman" w:cs="Times New Roman" w:eastAsia="Times New Roman" w:hAnsi="Times New Roman"/>
-        </w:rPr>
-        <w:t xml:space="preserve">{number}. {title}</w:t>
-      </w:r>
-    </w:p>
-    <w:p>
-      <w:r>
-        <w:rPr>
-          <w:rFonts w:ascii="Times New Roman" w:cs="Times New Roman" w:eastAsia="Times New Roman" w:hAnsi="Times New Roman"/>
-        </w:rPr>
-        <w:t xml:space="preserve">{/sections}</w:t>
-      </w:r>
-    </w:p>
-    <w:p>
       <w:r>
         <w:rPr>
           <w:rFonts w:ascii="Times New Roman" w:cs="Times New Roman" w:eastAsia="Times New Roman" w:hAnsi="Times New Roman"/>
@@ -648,10 +372,13 @@
     </w:p>
     <w:sectPr>
       <w:headerReference w:type="default" r:id="rId6"/>
-      <w:footerReference w:type="default" r:id="rId7"/>
+      <w:headerReference w:type="first" r:id="rId7"/>
+      <w:footerReference w:type="default" r:id="rId8"/>
+      <w:footerReference w:type="first" r:id="rId9"/>
       <w:pgSz w:w="11906" w:h="16838" w:orient="portrait"/>
       <w:pgMar w:top="1440" w:right="1440" w:bottom="1440" w:left="1440" w:header="708" w:footer="708" w:gutter="0"/>
       <w:pgNumType/>
+      <w:titlePg/>
       <w:docGrid w:linePitch="360"/>
     </w:sectPr>
   </w:body>
@@ -795,6 +522,12 @@
 </w:ftr>
 </file>
 
+<file path=word/footer2.xml><?xml version="1.0" encoding="utf-8"?>
+<w:ftr xmlns:wpc="http://schemas.microsoft.com/office/word/2010/wordprocessingCanvas" xmlns:mc="http://schemas.openxmlformats.org/markup-compatibility/2006" xmlns:o="urn:schemas-microsoft-com:office:office" xmlns:r="http://schemas.openxmlformats.org/officeDocument/2006/relationships" xmlns:m="http://schemas.openxmlformats.org/officeDocument/2006/math" xmlns:v="urn:schemas-microsoft-com:vml" xmlns:wp14="http://schemas.microsoft.com/office/word/2010/wordprocessingDrawing" xmlns:wp="http://schemas.openxmlformats.org/drawingml/2006/wordprocessingDrawing" xmlns:w10="urn:schemas-microsoft-com:office:word" xmlns:w="http://schemas.openxmlformats.org/wordprocessingml/2006/main" xmlns:w14="http://schemas.microsoft.com/office/word/2010/wordml" xmlns:w15="http://schemas.microsoft.com/office/word/2012/wordml" xmlns:wpg="http://schemas.microsoft.com/office/word/2010/wordprocessingGroup" xmlns:wpi="http://schemas.microsoft.com/office/word/2010/wordprocessingInk" xmlns:wne="http://schemas.microsoft.com/office/word/2006/wordml" xmlns:wps="http://schemas.microsoft.com/office/word/2010/wordprocessingShape">
+  <w:p/>
+</w:ftr>
+</file>
+
 <file path=word/footnotes.xml><?xml version="1.0" encoding="utf-8"?>
 <w:footnotes xmlns:wpc="http://schemas.microsoft.com/office/word/2010/wordprocessingCanvas" xmlns:mc="http://schemas.openxmlformats.org/markup-compatibility/2006" xmlns:o="urn:schemas-microsoft-com:office:office" xmlns:r="http://schemas.openxmlformats.org/officeDocument/2006/relationships" xmlns:m="http://schemas.openxmlformats.org/officeDocument/2006/math" xmlns:v="urn:schemas-microsoft-com:vml" xmlns:wp14="http://schemas.microsoft.com/office/word/2010/wordprocessingDrawing" xmlns:wp="http://schemas.openxmlformats.org/drawingml/2006/wordprocessingDrawing" xmlns:w10="urn:schemas-microsoft-com:office:word" xmlns:w="http://schemas.openxmlformats.org/wordprocessingml/2006/main" xmlns:w14="http://schemas.microsoft.com/office/word/2010/wordml" xmlns:w15="http://schemas.microsoft.com/office/word/2012/wordml" xmlns:wpg="http://schemas.microsoft.com/office/word/2010/wordprocessingGroup" xmlns:wpi="http://schemas.microsoft.com/office/word/2010/wordprocessingInk" xmlns:wne="http://schemas.microsoft.com/office/word/2006/wordml" xmlns:wps="http://schemas.microsoft.com/office/word/2010/wordprocessingShape" mc:Ignorable="w14 w15 wp14">
   <w:footnote w:type="separator" w:id="-1">
@@ -848,6 +581,12 @@
       <w:t xml:space="preserve">{courseCode}: {courseTitle}</w:t>
     </w:r>
   </w:p>
+</w:hdr>
+</file>
+
+<file path=word/header2.xml><?xml version="1.0" encoding="utf-8"?>
+<w:hdr xmlns:wpc="http://schemas.microsoft.com/office/word/2010/wordprocessingCanvas" xmlns:mc="http://schemas.openxmlformats.org/markup-compatibility/2006" xmlns:o="urn:schemas-microsoft-com:office:office" xmlns:r="http://schemas.openxmlformats.org/officeDocument/2006/relationships" xmlns:m="http://schemas.openxmlformats.org/officeDocument/2006/math" xmlns:v="urn:schemas-microsoft-com:vml" xmlns:wp14="http://schemas.microsoft.com/office/word/2010/wordprocessingDrawing" xmlns:wp="http://schemas.openxmlformats.org/drawingml/2006/wordprocessingDrawing" xmlns:w10="urn:schemas-microsoft-com:office:word" xmlns:w="http://schemas.openxmlformats.org/wordprocessingml/2006/main" xmlns:w14="http://schemas.microsoft.com/office/word/2010/wordml" xmlns:w15="http://schemas.microsoft.com/office/word/2012/wordml" xmlns:wpg="http://schemas.microsoft.com/office/word/2010/wordprocessingGroup" xmlns:wpi="http://schemas.microsoft.com/office/word/2010/wordprocessingInk" xmlns:wne="http://schemas.microsoft.com/office/word/2006/wordml" xmlns:wps="http://schemas.microsoft.com/office/word/2010/wordprocessingShape" xmlns:cx="http://schemas.microsoft.com/office/drawing/2014/chartex" xmlns:cx1="http://schemas.microsoft.com/office/drawing/2015/9/8/chartex" xmlns:cx2="http://schemas.microsoft.com/office/drawing/2015/10/21/chartex" xmlns:cx3="http://schemas.microsoft.com/office/drawing/2016/5/9/chartex" xmlns:cx4="http://schemas.microsoft.com/office/drawing/2016/5/10/chartex" xmlns:cx5="http://schemas.microsoft.com/office/drawing/2016/5/11/chartex" xmlns:cx6="http://schemas.microsoft.com/office/drawing/2016/5/12/chartex" xmlns:cx7="http://schemas.microsoft.com/office/drawing/2016/5/13/chartex" xmlns:cx8="http://schemas.microsoft.com/office/drawing/2016/5/14/chartex" xmlns:w16cid="http://schemas.microsoft.com/office/word/2016/wordml/cid" xmlns:w16se="http://schemas.microsoft.com/office/word/2015/wordml/symex">
+  <w:p/>
 </w:hdr>
 </file>
 

</xml_diff>